<commit_message>
Replace 종래기술 with single concrete prior art (Microsoft GraphRAG 2024)
- Cite arXiv:2404.16130, MS Research blog, and microsoft/graphrag repo as
  the single closest verifiable prior art
- Recast 종래기술 한계 as 7 specific gaps between Microsoft GraphRAG and
  the present invention's military image-intelligence domain
- Adds 진보성 closing statement enumerating the 7 distinguishing features
</commit_message>
<xml_diff>
--- a/data/AI에이전트_판독보고서_특허명세서.docx
+++ b/data/AI에이전트_판독보고서_특허명세서.docx
@@ -304,6 +304,19 @@
     </w:p>
     <w:p>
       <w:pPr>
+        <w:spacing w:before="160" w:after="40"/>
+      </w:pPr>
+      <w:r>
+        <w:rPr>
+          <w:rFonts w:ascii="맑은 고딕" w:hAnsi="맑은 고딕" w:eastAsia="맑은 고딕"/>
+          <w:b/>
+          <w:sz w:val="23"/>
+        </w:rPr>
+        <w:t>Microsoft Research, GraphRAG (2024)</w:t>
+      </w:r>
+    </w:p>
+    <w:p>
+      <w:pPr>
         <w:spacing w:after="80" w:line="360" w:lineRule="auto"/>
       </w:pPr>
       <w:r>
@@ -312,20 +325,7 @@
           <w:b w:val="0"/>
           <w:sz w:val="22"/>
         </w:rPr>
-        <w:t>본 분야에서 실제로 등록·공개되어 있는 유형(category)을 기재한다. 실제 출원 시 인용 특허 번호는 KIPRIS·Google Patents·Espacenet에서 변리사가 검증·교체한다.</w:t>
-      </w:r>
-    </w:p>
-    <w:p>
-      <w:pPr>
-        <w:spacing w:before="160" w:after="40"/>
-      </w:pPr>
-      <w:r>
-        <w:rPr>
-          <w:rFonts w:ascii="맑은 고딕" w:hAnsi="맑은 고딕" w:eastAsia="맑은 고딕"/>
-          <w:b/>
-          <w:sz w:val="23"/>
-        </w:rPr>
-        <w:t>가. LLM 기반 보고서 자동 생성 일반</w:t>
+        <w:t>본 발명과 가장 유사한 단일 종래 기술은 Microsoft Research가 2024년 4월 24일 공개한 GraphRAG 시스템이다. 해당 기술은 다음 문헌 및 공개 구현에 의해 명확히 기록되어 있어 특허 심사 단계에서 인용 가능한 공지기술에 해당한다.</w:t>
       </w:r>
     </w:p>
     <w:p>
@@ -340,7 +340,7 @@
           <w:b w:val="0"/>
           <w:sz w:val="22"/>
         </w:rPr>
-        <w:t>자연어 문서 코퍼스 기반 RAG(Retrieval-Augmented Generation) 보고서 생성 특허군 (검색 키: 'LLM 보고서 자동 생성 RAG', 'retrieval augmented generation report')</w:t>
+        <w:t>[비특허문헌 1] Darren Edge, Ha Trinh, Newman Cheng, Joshua Bradley, Alex Chao, Apurva Mody, Steven Truitt, Jonathan Larson, "From Local to Global: A Graph RAG Approach to Query-Focused Summarization", arXiv:2404.16130, Microsoft Research, 2024.04.24.</w:t>
       </w:r>
     </w:p>
     <w:p>
@@ -355,7 +355,7 @@
           <w:b w:val="0"/>
           <w:sz w:val="22"/>
         </w:rPr>
-        <w:t>정형 데이터(의료기록·금융 거래 등)로부터 LLM이 보고서를 생성하는 특허군 (검색 키: 'structured data report generation LLM', '프롬프트 기반 보고서 생성')</w:t>
+        <w:t>[비특허문헌 2] Microsoft, "GraphRAG: Unlocking LLM discovery on narrative private data", Microsoft Research Blog, 2024.02.13.</w:t>
       </w:r>
     </w:p>
     <w:p>
@@ -370,20 +370,20 @@
           <w:b w:val="0"/>
           <w:sz w:val="22"/>
         </w:rPr>
-        <w:t>Microsoft, "From Local to Global: A Graph RAG Approach to Query-Focused Summarization", arXiv:2404.16130 (2024)</w:t>
+        <w:t>[비특허문헌 3] Microsoft, GraphRAG 공식 오픈소스 구현 — https://github.com/microsoft/graphrag (Apache-2.0 License, 2024 공개).</w:t>
       </w:r>
     </w:p>
     <w:p>
       <w:pPr>
-        <w:spacing w:before="160" w:after="40"/>
+        <w:spacing w:after="80" w:line="360" w:lineRule="auto"/>
       </w:pPr>
       <w:r>
         <w:rPr>
           <w:rFonts w:ascii="맑은 고딕" w:hAnsi="맑은 고딕" w:eastAsia="맑은 고딕"/>
-          <w:b/>
-          <w:sz w:val="23"/>
+          <w:b w:val="0"/>
+          <w:sz w:val="22"/>
         </w:rPr>
-        <w:t>나. 위성·드론 영상 객체 탐지 및 변화 탐지</w:t>
+        <w:t>Microsoft GraphRAG의 핵심 구성은 다음과 같다.</w:t>
       </w:r>
     </w:p>
     <w:p>
@@ -398,7 +398,7 @@
           <w:b w:val="0"/>
           <w:sz w:val="22"/>
         </w:rPr>
-        <w:t>SAM/SAM2/SAM3 등 Meta의 Segment Anything Model 관련 출원 및 논문</w:t>
+        <w:t>(가) 입력 문서 코퍼스(자연어 텍스트)를 청크 단위로 분할한 후, 대규모 언어 모델(LLM)을 이용해 각 청크에서 엔티티(entity)와 관계(relation)를 추출하여 지식 그래프를 구축한다.</w:t>
       </w:r>
     </w:p>
     <w:p>
@@ -413,7 +413,7 @@
           <w:b w:val="0"/>
           <w:sz w:val="22"/>
         </w:rPr>
-        <w:t>위성영상 시계열 변화탐지(change detection) 특허군 (검색 키: 'satellite imagery change detection patent', '위성영상 변화탐지')</w:t>
+        <w:t>(나) 구축된 지식 그래프에 대해 Leiden 등의 그래프 군집 알고리즘을 적용해 계층적 커뮤니티를 탐지하고, 각 커뮤니티의 요약문을 LLM이 자연어로 생성하여 보고서 형태로 저장한다.</w:t>
       </w:r>
     </w:p>
     <w:p>
@@ -428,20 +428,7 @@
           <w:b w:val="0"/>
           <w:sz w:val="22"/>
         </w:rPr>
-        <w:t>Project Maven(미 국방부 AWCFT) 관련 공개 자료</w:t>
-      </w:r>
-    </w:p>
-    <w:p>
-      <w:pPr>
-        <w:spacing w:before="160" w:after="40"/>
-      </w:pPr>
-      <w:r>
-        <w:rPr>
-          <w:rFonts w:ascii="맑은 고딕" w:hAnsi="맑은 고딕" w:eastAsia="맑은 고딕"/>
-          <w:b/>
-          <w:sz w:val="23"/>
-        </w:rPr>
-        <w:t>다. 군사 IMINT 보고서·doctrine 분야</w:t>
+        <w:t>(다) 사용자 질의에 대해 (i) 노드 이웃 단위로 검색하는 Local Search 모드와 (ii) 커뮤니티 요약을 검색하는 Global Search 모드의 두 가지 검색을 제공한다.</w:t>
       </w:r>
     </w:p>
     <w:p>
@@ -456,65 +443,7 @@
           <w:b w:val="0"/>
           <w:sz w:val="22"/>
         </w:rPr>
-        <w:t>정형 IMINT 보고서 형식(CLASSIFICATION/EXECUTIVE SUMMARY/SITUATION/…)을 자동 작성하는 시스템 특허군 (검색 키: 'intelligence report automation', 'IMINT report generation')</w:t>
-      </w:r>
-    </w:p>
-    <w:p>
-      <w:pPr>
-        <w:pStyle w:val="ListBullet"/>
-        <w:spacing w:line="336" w:lineRule="auto"/>
-        <w:ind w:left="425"/>
-      </w:pPr>
-      <w:r>
-        <w:rPr>
-          <w:rFonts w:ascii="맑은 고딕" w:hAnsi="맑은 고딕" w:eastAsia="맑은 고딕"/>
-          <w:b w:val="0"/>
-          <w:sz w:val="22"/>
-        </w:rPr>
-        <w:t>군사 의사결정 보조 AI 시스템 특허군 (Palantir 등)</w:t>
-      </w:r>
-    </w:p>
-    <w:p>
-      <w:pPr>
-        <w:spacing w:before="160" w:after="40"/>
-      </w:pPr>
-      <w:r>
-        <w:rPr>
-          <w:rFonts w:ascii="맑은 고딕" w:hAnsi="맑은 고딕" w:eastAsia="맑은 고딕"/>
-          <w:b/>
-          <w:sz w:val="23"/>
-        </w:rPr>
-        <w:t>라. AI 에이전트(Agent) 일반</w:t>
-      </w:r>
-    </w:p>
-    <w:p>
-      <w:pPr>
-        <w:pStyle w:val="ListBullet"/>
-        <w:spacing w:line="336" w:lineRule="auto"/>
-        <w:ind w:left="425"/>
-      </w:pPr>
-      <w:r>
-        <w:rPr>
-          <w:rFonts w:ascii="맑은 고딕" w:hAnsi="맑은 고딕" w:eastAsia="맑은 고딕"/>
-          <w:b w:val="0"/>
-          <w:sz w:val="22"/>
-        </w:rPr>
-        <w:t>다중 단계 도구 사용(tool-use) 기반 AI 에이전트 특허군 (검색 키: 'AI agent tool use', 'multi-step LLM agent')</w:t>
-      </w:r>
-    </w:p>
-    <w:p>
-      <w:pPr>
-        <w:pStyle w:val="ListBullet"/>
-        <w:spacing w:line="336" w:lineRule="auto"/>
-        <w:ind w:left="425"/>
-      </w:pPr>
-      <w:r>
-        <w:rPr>
-          <w:rFonts w:ascii="맑은 고딕" w:hAnsi="맑은 고딕" w:eastAsia="맑은 고딕"/>
-          <w:b w:val="0"/>
-          <w:sz w:val="22"/>
-        </w:rPr>
-        <w:t>동일 LLM을 반복 호출하여 생성→번역→검증을 수행하는 에이전트 패턴</w:t>
+        <w:t>(라) 검색 결과를 LLM 프롬프트에 컨텍스트로 주입하여 질의응답 또는 요약을 생성한다.</w:t>
       </w:r>
     </w:p>
     <w:p>
@@ -528,6 +457,19 @@
           <w:sz w:val="26"/>
         </w:rPr>
         <w:t>(5) 종래 기술의 문제점 / 한계</w:t>
+      </w:r>
+    </w:p>
+    <w:p>
+      <w:pPr>
+        <w:spacing w:after="80" w:line="360" w:lineRule="auto"/>
+      </w:pPr>
+      <w:r>
+        <w:rPr>
+          <w:rFonts w:ascii="맑은 고딕" w:hAnsi="맑은 고딕" w:eastAsia="맑은 고딕"/>
+          <w:b w:val="0"/>
+          <w:sz w:val="22"/>
+        </w:rPr>
+        <w:t>Microsoft GraphRAG는 자연어 문서 코퍼스에 대한 일반 목적의 질의응답·요약 시스템으로 설계되어, 본 발명의 적용 도메인인 군사 위성·드론 영상 인텔리전스 보고서 자동 생성에 그대로 적용할 경우 아래와 같은 본질적 한계를 갖는다.</w:t>
       </w:r>
     </w:p>
     <w:tbl>
@@ -544,7 +486,7 @@
       <w:tr>
         <w:tc>
           <w:tcPr>
-            <w:tcW w:type="dxa" w:w="567"/>
+            <w:tcW w:type="dxa" w:w="454"/>
           </w:tcPr>
           <w:p>
             <w:r/>
@@ -560,7 +502,7 @@
         </w:tc>
         <w:tc>
           <w:tcPr>
-            <w:tcW w:type="dxa" w:w="2268"/>
+            <w:tcW w:type="dxa" w:w="2551"/>
           </w:tcPr>
           <w:p>
             <w:r/>
@@ -570,13 +512,13 @@
                 <w:b/>
                 <w:sz w:val="21"/>
               </w:rPr>
-              <w:t>문제</w:t>
+              <w:t>Microsoft GraphRAG의 한계</w:t>
             </w:r>
           </w:p>
         </w:tc>
         <w:tc>
           <w:tcPr>
-            <w:tcW w:type="dxa" w:w="6236"/>
+            <w:tcW w:type="dxa" w:w="6066"/>
           </w:tcPr>
           <w:p>
             <w:r/>
@@ -586,7 +528,7 @@
                 <w:b/>
                 <w:sz w:val="21"/>
               </w:rPr>
-              <w:t>내용</w:t>
+              <w:t>본 발명 적용 시 문제점</w:t>
             </w:r>
           </w:p>
         </w:tc>
@@ -594,7 +536,7 @@
       <w:tr>
         <w:tc>
           <w:tcPr>
-            <w:tcW w:type="dxa" w:w="567"/>
+            <w:tcW w:type="dxa" w:w="454"/>
           </w:tcPr>
           <w:p>
             <w:r/>
@@ -610,7 +552,7 @@
         </w:tc>
         <w:tc>
           <w:tcPr>
-            <w:tcW w:type="dxa" w:w="2268"/>
+            <w:tcW w:type="dxa" w:w="2551"/>
           </w:tcPr>
           <w:p>
             <w:r/>
@@ -620,13 +562,13 @@
                 <w:b w:val="0"/>
                 <w:sz w:val="20"/>
               </w:rPr>
-              <w:t>단발 프레임 한계</w:t>
+              <w:t>입력 도메인 불일치 — 자연어 vs 정형 영상 탐지 튜플</w:t>
             </w:r>
           </w:p>
         </w:tc>
         <w:tc>
           <w:tcPr>
-            <w:tcW w:type="dxa" w:w="6236"/>
+            <w:tcW w:type="dxa" w:w="6066"/>
           </w:tcPr>
           <w:p>
             <w:r/>
@@ -636,7 +578,7 @@
                 <w:b w:val="0"/>
                 <w:sz w:val="20"/>
               </w:rPr>
-              <w:t>1프레임의 탐지 결과만 LLM에 전달하여 시계열 패턴이 보고서에 반영되지 않음.</w:t>
+              <w:t>Microsoft GraphRAG는 입력을 '자연어 텍스트 청크'로 전제한다. 그러나 본 발명의 입력은 영상 객체 탐지·페어링 결과인 정형 튜플(class, lat, lon, status, confidence, time)이다. 이를 GraphRAG에 적용하려면 (i) 정형 튜플을 자연어로 풀어서 → (ii) 청크화 → (iii) 임베딩 → (iv) LLM 엔티티 추출의 4단계 우회를 거쳐야 하며 그 과정에서 정확한 수치(좌표·신뢰도)가 토큰화 손실을 입는다.</w:t>
             </w:r>
           </w:p>
         </w:tc>
@@ -644,7 +586,7 @@
       <w:tr>
         <w:tc>
           <w:tcPr>
-            <w:tcW w:type="dxa" w:w="567"/>
+            <w:tcW w:type="dxa" w:w="454"/>
           </w:tcPr>
           <w:p>
             <w:r/>
@@ -660,7 +602,7 @@
         </w:tc>
         <w:tc>
           <w:tcPr>
-            <w:tcW w:type="dxa" w:w="2268"/>
+            <w:tcW w:type="dxa" w:w="2551"/>
           </w:tcPr>
           <w:p>
             <w:r/>
@@ -670,13 +612,13 @@
                 <w:b w:val="0"/>
                 <w:sz w:val="20"/>
               </w:rPr>
-              <w:t>텍스트 RAG의 부적합성</w:t>
+              <w:t>LLM 의존 비결정적 엔티티 추출</w:t>
             </w:r>
           </w:p>
         </w:tc>
         <w:tc>
           <w:tcPr>
-            <w:tcW w:type="dxa" w:w="6236"/>
+            <w:tcW w:type="dxa" w:w="6066"/>
           </w:tcPr>
           <w:p>
             <w:r/>
@@ -686,7 +628,7 @@
                 <w:b w:val="0"/>
                 <w:sz w:val="20"/>
               </w:rPr>
-              <w:t>입력이 정형 튜플(클래스·좌표·신뢰도·시각)인데 자연어로 풀어 다시 임베딩하는 우회 구조 → 정보 손실·임베딩 비용·비결정성.</w:t>
+              <w:t>Microsoft GraphRAG는 그래프 노드·엣지 추출을 LLM 호출로 수행한다. 동일 입력에 대해 매번 다른 엔티티가 추출될 수 있어 군사 시스템에 요구되는 결정론·재현성·감사가능성을 만족하지 못한다. 또한 노드 수가 증가할수록 LLM 호출 비용이 선형으로 증가한다.</w:t>
             </w:r>
           </w:p>
         </w:tc>
@@ -694,7 +636,7 @@
       <w:tr>
         <w:tc>
           <w:tcPr>
-            <w:tcW w:type="dxa" w:w="567"/>
+            <w:tcW w:type="dxa" w:w="454"/>
           </w:tcPr>
           <w:p>
             <w:r/>
@@ -710,7 +652,7 @@
         </w:tc>
         <w:tc>
           <w:tcPr>
-            <w:tcW w:type="dxa" w:w="2268"/>
+            <w:tcW w:type="dxa" w:w="2551"/>
           </w:tcPr>
           <w:p>
             <w:r/>
@@ -720,13 +662,13 @@
                 <w:b w:val="0"/>
                 <w:sz w:val="20"/>
               </w:rPr>
-              <w:t>집계·관계 질의 약점</w:t>
+              <w:t>시계열 누적 메커니즘 부재</w:t>
             </w:r>
           </w:p>
         </w:tc>
         <w:tc>
           <w:tcPr>
-            <w:tcW w:type="dxa" w:w="6236"/>
+            <w:tcW w:type="dxa" w:w="6066"/>
           </w:tcPr>
           <w:p>
             <w:r/>
@@ -736,7 +678,7 @@
                 <w:b w:val="0"/>
                 <w:sz w:val="20"/>
               </w:rPr>
-              <w:t>"이 객체가 몇 번째 출현인가", "함께 자주 등장하는 객체는?" 등을 LLM에 떠넘김 → 응답 일관성 저하.</w:t>
+              <w:t>Microsoft GraphRAG는 정적 코퍼스에 대한 단일 인덱싱을 전제로 한다. 동일 자산이 다른 시점에 동일 지역에서 반복 관측될 때 이를 동일 엔티티로 누적 카운팅하는 결정론적 키 메커니즘이 정의되어 있지 않다. 결과적으로 '이 지역에서 N번째 반복 출현' 같은 시계열 패턴이 보고서에 반영되지 못한다.</w:t>
             </w:r>
           </w:p>
         </w:tc>
@@ -744,7 +686,7 @@
       <w:tr>
         <w:tc>
           <w:tcPr>
-            <w:tcW w:type="dxa" w:w="567"/>
+            <w:tcW w:type="dxa" w:w="454"/>
           </w:tcPr>
           <w:p>
             <w:r/>
@@ -760,7 +702,7 @@
         </w:tc>
         <w:tc>
           <w:tcPr>
-            <w:tcW w:type="dxa" w:w="2268"/>
+            <w:tcW w:type="dxa" w:w="2551"/>
           </w:tcPr>
           <w:p>
             <w:r/>
@@ -770,13 +712,13 @@
                 <w:b w:val="0"/>
                 <w:sz w:val="20"/>
               </w:rPr>
-              <w:t>GPS 노이즈 취약</w:t>
+              <w:t>GPS 노이즈 흡수 메커니즘 부재</w:t>
             </w:r>
           </w:p>
         </w:tc>
         <w:tc>
           <w:tcPr>
-            <w:tcW w:type="dxa" w:w="6236"/>
+            <w:tcW w:type="dxa" w:w="6066"/>
           </w:tcPr>
           <w:p>
             <w:r/>
@@ -786,7 +728,7 @@
                 <w:b w:val="0"/>
                 <w:sz w:val="20"/>
               </w:rPr>
-              <w:t>같은 객체 좌표 미세 차이를 동일 인스턴스로 흡수하는 결정론적 메커니즘 부재.</w:t>
+              <w:t>동일 객체의 두 관측이 GPS 측정 오차로 미세하게 다른 좌표(예: 37.5765 ↔ 37.5766)일 때 Microsoft GraphRAG는 두 좌표를 서로 다른 엔티티로 임베딩한다. 이를 동일 자산으로 통합하기 위한 격자 양자화(quantization) 단계가 부재하다.</w:t>
             </w:r>
           </w:p>
         </w:tc>
@@ -794,7 +736,7 @@
       <w:tr>
         <w:tc>
           <w:tcPr>
-            <w:tcW w:type="dxa" w:w="567"/>
+            <w:tcW w:type="dxa" w:w="454"/>
           </w:tcPr>
           <w:p>
             <w:r/>
@@ -810,7 +752,7 @@
         </w:tc>
         <w:tc>
           <w:tcPr>
-            <w:tcW w:type="dxa" w:w="2268"/>
+            <w:tcW w:type="dxa" w:w="2551"/>
           </w:tcPr>
           <w:p>
             <w:r/>
@@ -820,13 +762,13 @@
                 <w:b w:val="0"/>
                 <w:sz w:val="20"/>
               </w:rPr>
-              <w:t>군사 의미론 부재</w:t>
+              <w:t>도메인 안전성 제약 부재</w:t>
             </w:r>
           </w:p>
         </w:tc>
         <w:tc>
           <w:tcPr>
-            <w:tcW w:type="dxa" w:w="6236"/>
+            <w:tcW w:type="dxa" w:w="6066"/>
           </w:tcPr>
           <w:p>
             <w:r/>
@@ -836,7 +778,7 @@
                 <w:b w:val="0"/>
                 <w:sz w:val="20"/>
               </w:rPr>
-              <w:t>'소실(disappeared)'을 '파괴(destroyed)'로 LLM이 오해석할 위험 → 군사적 오판 가능성.</w:t>
+              <w:t>Microsoft GraphRAG는 일반 목적 프롬프트를 사용하므로 군사 도메인의 의미론적 가드레일 (예: 'DISAPPEARED'를 'destroyed'로 오해석하면 안 됨)을 시스템 프롬프트에 강제하는 구성이 없다. 일반 LLM이 '미관측'을 '확정 파괴'로 표현하여 군사적 오판을 유발할 수 있다.</w:t>
             </w:r>
           </w:p>
         </w:tc>
@@ -844,7 +786,7 @@
       <w:tr>
         <w:tc>
           <w:tcPr>
-            <w:tcW w:type="dxa" w:w="567"/>
+            <w:tcW w:type="dxa" w:w="454"/>
           </w:tcPr>
           <w:p>
             <w:r/>
@@ -860,7 +802,7 @@
         </w:tc>
         <w:tc>
           <w:tcPr>
-            <w:tcW w:type="dxa" w:w="2268"/>
+            <w:tcW w:type="dxa" w:w="2551"/>
           </w:tcPr>
           <w:p>
             <w:r/>
@@ -870,13 +812,13 @@
                 <w:b w:val="0"/>
                 <w:sz w:val="20"/>
               </w:rPr>
-              <w:t>토큰 효율 문제</w:t>
+              <w:t>변화 객체 한정 메커니즘 부재</w:t>
             </w:r>
           </w:p>
         </w:tc>
         <w:tc>
           <w:tcPr>
-            <w:tcW w:type="dxa" w:w="6236"/>
+            <w:tcW w:type="dxa" w:w="6066"/>
           </w:tcPr>
           <w:p>
             <w:r/>
@@ -886,7 +828,7 @@
                 <w:b w:val="0"/>
                 <w:sz w:val="20"/>
               </w:rPr>
-              <w:t>모든 탐지 결과(정지·이동 포함)를 LLM에 전달 → 변화 분석에 무관한 객체로 컨텍스트 낭비.</w:t>
+              <w:t>Microsoft GraphRAG는 검색된 모든 컨텍스트를 LLM에 전달한다. 군사 변화 분석에 필요한 신규 출현(new)·소실(disappeared) 객체만을 추출해 토큰을 절약하는 도메인 특화 필터링 구성이 없다.</w:t>
             </w:r>
           </w:p>
         </w:tc>
@@ -894,7 +836,7 @@
       <w:tr>
         <w:tc>
           <w:tcPr>
-            <w:tcW w:type="dxa" w:w="567"/>
+            <w:tcW w:type="dxa" w:w="454"/>
           </w:tcPr>
           <w:p>
             <w:r/>
@@ -910,7 +852,7 @@
         </w:tc>
         <w:tc>
           <w:tcPr>
-            <w:tcW w:type="dxa" w:w="2268"/>
+            <w:tcW w:type="dxa" w:w="2551"/>
           </w:tcPr>
           <w:p>
             <w:r/>
@@ -920,13 +862,13 @@
                 <w:b w:val="0"/>
                 <w:sz w:val="20"/>
               </w:rPr>
-              <w:t>감사 가능성 부족</w:t>
+              <w:t>정형 IMINT 보고서 형식 강제 부재</w:t>
             </w:r>
           </w:p>
         </w:tc>
         <w:tc>
           <w:tcPr>
-            <w:tcW w:type="dxa" w:w="6236"/>
+            <w:tcW w:type="dxa" w:w="6066"/>
           </w:tcPr>
           <w:p>
             <w:r/>
@@ -936,13 +878,26 @@
                 <w:b w:val="0"/>
                 <w:sz w:val="20"/>
               </w:rPr>
-              <w:t>LLM이 왜 특정 결론을 도출했는지 행 단위로 추적 불가 → 군사·법적 책임 환경에서 운용 곤란.</w:t>
+              <w:t>Microsoft GraphRAG는 일반 요약문을 산출한다. CLASSIFICATION/EXECUTIVE SUMMARY/SITUATION/CHANGE ANALYSIS/THREAT ASSESSMENT/INTELLIGENCE GAPS/RECOMMENDED ACTIONS/APPENDIX의 표준 IMINT 8개 섹션을 강제하여 분석관 친화 산출물을 보장하는 구성이 없다.</w:t>
             </w:r>
           </w:p>
         </w:tc>
       </w:tr>
     </w:tbl>
     <w:p/>
+    <w:p>
+      <w:pPr>
+        <w:spacing w:after="80" w:line="360" w:lineRule="auto"/>
+      </w:pPr>
+      <w:r>
+        <w:rPr>
+          <w:rFonts w:ascii="맑은 고딕" w:hAnsi="맑은 고딕" w:eastAsia="맑은 고딕"/>
+          <w:b w:val="0"/>
+          <w:sz w:val="22"/>
+        </w:rPr>
+        <w:t>따라서 Microsoft GraphRAG는 본 발명의 직접적 종래 기술이나, 군사 영상 인텔리전스 도메인에서 요구되는 (i) 정형 튜플 직접 인덱싱, (ii) 결정론적 LLM-free 엔티티 추출, (iii) 시계열 누적 카운터, (iv) 격자 양자화, (v) 도메인 의미론 제약, (vi) 변화 객체 한정 전달, (vii) 표준 IMINT 형식 강제의 7가지 차별 구성을 모두 결여하고 있으므로 본 발명의 진보성이 인정된다.</w:t>
+      </w:r>
+    </w:p>
     <w:p>
       <w:pPr>
         <w:spacing w:before="360" w:after="120"/>

</xml_diff>

<commit_message>
Reframe 종래기술 from LLM-Agent perspective using Palantir AIP
The patent's core claim is 'AI Agent for intelligence report' — so the
nearest real prior art belongs to the LLM-Agent + defense-reporting
category, not the GraphRAG-internals category.

- Replace Microsoft GraphRAG with Palantir AIP (2023) as single closest
  publicly-verifiable prior art
- Cite official Palantir announcement video, product docs, and the
  'Responding to Adversary Movement' defense demo
- Recast 7 differentiation points around (i) deterministic temporal
  graph memory, (ii) Louvain co-occurrence pattern discovery,
  (iii) DISAPPEARED semantic guardrail, (iv) new/disappeared filter,
  (v) IMINT 8-section enforcement, (vi) grid quantization,
  (vii) ontology-free auto indexing
</commit_message>
<xml_diff>
--- a/data/AI에이전트_판독보고서_특허명세서.docx
+++ b/data/AI에이전트_판독보고서_특허명세서.docx
@@ -312,7 +312,7 @@
           <w:b/>
           <w:sz w:val="23"/>
         </w:rPr>
-        <w:t>Microsoft Research, GraphRAG (2024)</w:t>
+        <w:t>Palantir AIP (Artificial Intelligence Platform), 2023</w:t>
       </w:r>
     </w:p>
     <w:p>
@@ -325,7 +325,7 @@
           <w:b w:val="0"/>
           <w:sz w:val="22"/>
         </w:rPr>
-        <w:t>본 발명과 가장 유사한 단일 종래 기술은 Microsoft Research가 2024년 4월 24일 공개한 GraphRAG 시스템이다. 해당 기술은 다음 문헌 및 공개 구현에 의해 명확히 기록되어 있어 특허 심사 단계에서 인용 가능한 공지기술에 해당한다.</w:t>
+        <w:t>본 발명과 가장 유사한 단일 종래 기술은 Palantir Technologies가 2023년 4월 공개·시연한 AIP(Artificial Intelligence Platform) 시스템이다. AIP는 대규모 언어 모델(LLM)을 도구 사용 기반 에이전트로 활용하여 군사·정보 분야의 정형 데이터로부터 인텔리전스 보고서·의사결정 보조 출력을 자동 생성하는 상용 플랫폼으로, 본 발명이 속하는 "LLM 에이전트 기반 판독보고서 자동 생성" 카테고리에서 가장 직접적으로 공개·시연된 선행 시스템에 해당한다.</w:t>
       </w:r>
     </w:p>
     <w:p>
@@ -340,7 +340,7 @@
           <w:b w:val="0"/>
           <w:sz w:val="22"/>
         </w:rPr>
-        <w:t>[비특허문헌 1] Darren Edge, Ha Trinh, Newman Cheng, Joshua Bradley, Alex Chao, Apurva Mody, Steven Truitt, Jonathan Larson, "From Local to Global: A Graph RAG Approach to Query-Focused Summarization", arXiv:2404.16130, Microsoft Research, 2024.04.24.</w:t>
+        <w:t>[비특허문헌 1] Palantir Technologies, "Introducing AIP — Palantir Artificial Intelligence Platform", Official product announcement &amp; demonstration video (YouTube), 2023.04.25.</w:t>
       </w:r>
     </w:p>
     <w:p>
@@ -355,7 +355,7 @@
           <w:b w:val="0"/>
           <w:sz w:val="22"/>
         </w:rPr>
-        <w:t>[비특허문헌 2] Microsoft, "GraphRAG: Unlocking LLM discovery on narrative private data", Microsoft Research Blog, 2024.02.13.</w:t>
+        <w:t>[비특허문헌 2] Palantir Technologies, "Palantir AIP | Defense and Military", Official product documentation page, palantir.com/platforms/aip.</w:t>
       </w:r>
     </w:p>
     <w:p>
@@ -370,7 +370,7 @@
           <w:b w:val="0"/>
           <w:sz w:val="22"/>
         </w:rPr>
-        <w:t>[비특허문헌 3] Microsoft, GraphRAG 공식 오픈소스 구현 — https://github.com/microsoft/graphrag (Apache-2.0 License, 2024 공개).</w:t>
+        <w:t>[비특허문헌 3] Palantir Technologies, AIP defense use-case demo ("Responding to Adversary Movement" 시나리오) — 위성·정찰 정보를 LLM 에이전트가 분석해 지휘관에게 보고하는 공개 시연 영상, 2023.</w:t>
       </w:r>
     </w:p>
     <w:p>
@@ -383,7 +383,20 @@
           <w:b w:val="0"/>
           <w:sz w:val="22"/>
         </w:rPr>
-        <w:t>Microsoft GraphRAG의 핵심 구성은 다음과 같다.</w:t>
+        <w:t>(특허 출원 시 변리사가 Palantir 및 관련 특허 패밀리 US 출원번호를 KIPRIS·USPTO에서 검증·보완 권장.)</w:t>
+      </w:r>
+    </w:p>
+    <w:p>
+      <w:pPr>
+        <w:spacing w:after="80" w:line="360" w:lineRule="auto"/>
+      </w:pPr>
+      <w:r>
+        <w:rPr>
+          <w:rFonts w:ascii="맑은 고딕" w:hAnsi="맑은 고딕" w:eastAsia="맑은 고딕"/>
+          <w:b w:val="0"/>
+          <w:sz w:val="22"/>
+        </w:rPr>
+        <w:t>Palantir AIP의 핵심 구성은 다음과 같이 공개되어 있다.</w:t>
       </w:r>
     </w:p>
     <w:p>
@@ -398,7 +411,7 @@
           <w:b w:val="0"/>
           <w:sz w:val="22"/>
         </w:rPr>
-        <w:t>(가) 입력 문서 코퍼스(자연어 텍스트)를 청크 단위로 분할한 후, 대규모 언어 모델(LLM)을 이용해 각 청크에서 엔티티(entity)와 관계(relation)를 추출하여 지식 그래프를 구축한다.</w:t>
+        <w:t>(가) 위성·정찰·센서로부터 수집된 다중 소스 정형 데이터(객체 위치·시각·식별 정보 등)를 Foundry Ontology에 등록하여 통합 데이터 레이어를 구성한다.</w:t>
       </w:r>
     </w:p>
     <w:p>
@@ -413,7 +426,7 @@
           <w:b w:val="0"/>
           <w:sz w:val="22"/>
         </w:rPr>
-        <w:t>(나) 구축된 지식 그래프에 대해 Leiden 등의 그래프 군집 알고리즘을 적용해 계층적 커뮤니티를 탐지하고, 각 커뮤니티의 요약문을 LLM이 자연어로 생성하여 보고서 형태로 저장한다.</w:t>
+        <w:t>(나) LLM(GPT-4 등)을 에이전트로 활용하여 자연어 지시(예: "적 부대의 이동을 분석하고 대응 방안을 제시하라")를 받아 도구 사용(tool-use)을 통해 데이터 조회·분석·시뮬레이션을 수행하고 그 결과를 자연어 보고서로 출력한다.</w:t>
       </w:r>
     </w:p>
     <w:p>
@@ -428,7 +441,7 @@
           <w:b w:val="0"/>
           <w:sz w:val="22"/>
         </w:rPr>
-        <w:t>(다) 사용자 질의에 대해 (i) 노드 이웃 단위로 검색하는 Local Search 모드와 (ii) 커뮤니티 요약을 검색하는 Global Search 모드의 두 가지 검색을 제공한다.</w:t>
+        <w:t>(다) 출력 보고서는 분석관·지휘관 친화 형식(요약·권고사항 포함)을 따르며, 사용자가 추가 질의를 통해 보고서를 정제(refine)할 수 있는 대화형 에이전트 워크플로우를 제공한다.</w:t>
       </w:r>
     </w:p>
     <w:p>
@@ -443,7 +456,7 @@
           <w:b w:val="0"/>
           <w:sz w:val="22"/>
         </w:rPr>
-        <w:t>(라) 검색 결과를 LLM 프롬프트에 컨텍스트로 주입하여 질의응답 또는 요약을 생성한다.</w:t>
+        <w:t>(라) 보안·감사(audit) 목적으로 에이전트의 모든 데이터 접근 및 도구 호출 이력을 로깅한다.</w:t>
       </w:r>
     </w:p>
     <w:p>
@@ -469,7 +482,7 @@
           <w:b w:val="0"/>
           <w:sz w:val="22"/>
         </w:rPr>
-        <w:t>Microsoft GraphRAG는 자연어 문서 코퍼스에 대한 일반 목적의 질의응답·요약 시스템으로 설계되어, 본 발명의 적용 도메인인 군사 위성·드론 영상 인텔리전스 보고서 자동 생성에 그대로 적용할 경우 아래와 같은 본질적 한계를 갖는다.</w:t>
+        <w:t>Palantir AIP는 LLM 에이전트를 활용한 인텔리전스 보고서 자동 생성 분야의 가장 직접적인 선행 시스템이나, 본 발명과 비교할 때 아래와 같은 본질적 한계를 갖는다.</w:t>
       </w:r>
     </w:p>
     <w:tbl>
@@ -512,7 +525,7 @@
                 <w:b/>
                 <w:sz w:val="21"/>
               </w:rPr>
-              <w:t>Microsoft GraphRAG의 한계</w:t>
+              <w:t>Palantir AIP의 한계</w:t>
             </w:r>
           </w:p>
         </w:tc>
@@ -562,7 +575,7 @@
                 <w:b w:val="0"/>
                 <w:sz w:val="20"/>
               </w:rPr>
-              <w:t>입력 도메인 불일치 — 자연어 vs 정형 영상 탐지 튜플</w:t>
+              <w:t>시계열 누적 메모리 부재 — 매 질의가 독립적</w:t>
             </w:r>
           </w:p>
         </w:tc>
@@ -578,7 +591,7 @@
                 <w:b w:val="0"/>
                 <w:sz w:val="20"/>
               </w:rPr>
-              <w:t>Microsoft GraphRAG는 입력을 '자연어 텍스트 청크'로 전제한다. 그러나 본 발명의 입력은 영상 객체 탐지·페어링 결과인 정형 튜플(class, lat, lon, status, confidence, time)이다. 이를 GraphRAG에 적용하려면 (i) 정형 튜플을 자연어로 풀어서 → (ii) 청크화 → (iii) 임베딩 → (iv) LLM 엔티티 추출의 4단계 우회를 거쳐야 하며 그 과정에서 정확한 수치(좌표·신뢰도)가 토큰화 손실을 입는다.</w:t>
+              <w:t>Palantir AIP의 에이전트는 매 질의 시점의 데이터 스냅샷을 LLM에 제공한다. 동일 지역에서 동일 자산이 다수 세션에 걸쳐 반복 관측될 때 이를 누적 통계로 압축하여 LLM에게 제시하는 결정론적 메모리 구조가 부재하다. 결과적으로 "이 지역 10일간 5회째 반복 배치, 직전 3회 모두 소실 후 재출현" 같은 시계열 패턴을 LLM이 인식하지 못한다.</w:t>
             </w:r>
           </w:p>
         </w:tc>
@@ -612,7 +625,7 @@
                 <w:b w:val="0"/>
                 <w:sz w:val="20"/>
               </w:rPr>
-              <w:t>LLM 의존 비결정적 엔티티 추출</w:t>
+              <w:t>자산 간 결합 패턴 자동 발견 부재</w:t>
             </w:r>
           </w:p>
         </w:tc>
@@ -628,7 +641,7 @@
                 <w:b w:val="0"/>
                 <w:sz w:val="20"/>
               </w:rPr>
-              <w:t>Microsoft GraphRAG는 그래프 노드·엣지 추출을 LLM 호출로 수행한다. 동일 입력에 대해 매번 다른 엔티티가 추출될 수 있어 군사 시스템에 요구되는 결정론·재현성·감사가능성을 만족하지 못한다. 또한 노드 수가 증가할수록 LLM 호출 비용이 선형으로 증가한다.</w:t>
+              <w:t>Palantir AIP는 LLM 에이전트가 사용자 질의에 응답해 데이터를 *조회*하는 구조이며, 관측 데이터 자체에서 자산 클래스 간 공출현 패턴(예: 기갑+포병 복합체, C2 인프라)을 그래프 알고리즘으로 자동 군집화·발견하는 구성이 없다. doctrine 패턴 식별을 사용자 질의 기술 수준에 의존하게 된다.</w:t>
             </w:r>
           </w:p>
         </w:tc>
@@ -662,7 +675,7 @@
                 <w:b w:val="0"/>
                 <w:sz w:val="20"/>
               </w:rPr>
-              <w:t>시계열 누적 메커니즘 부재</w:t>
+              <w:t>도메인 안전성 제약 부재 — 'DISAPPEARED' 의미 가드레일</w:t>
             </w:r>
           </w:p>
         </w:tc>
@@ -678,7 +691,7 @@
                 <w:b w:val="0"/>
                 <w:sz w:val="20"/>
               </w:rPr>
-              <w:t>Microsoft GraphRAG는 정적 코퍼스에 대한 단일 인덱싱을 전제로 한다. 동일 자산이 다른 시점에 동일 지역에서 반복 관측될 때 이를 동일 엔티티로 누적 카운팅하는 결정론적 키 메커니즘이 정의되어 있지 않다. 결과적으로 '이 지역에서 N번째 반복 출현' 같은 시계열 패턴이 보고서에 반영되지 못한다.</w:t>
+              <w:t>Palantir AIP는 일반 목적의 LLM 에이전트로, 군사 영상 인텔리전스 도메인 특유의 의미론적 제약(예: 영상 미관측의 'DISAPPEARED'를 'destroyed'로 표현해서는 안 됨)을 시스템 프롬프트에 강제 주입하는 구성이 정의되어 있지 않다. 일반 LLM이 미관측 객체를 확정 파괴로 보고할 위험이 남아 군사적 오판을 유발할 수 있다.</w:t>
             </w:r>
           </w:p>
         </w:tc>
@@ -712,7 +725,7 @@
                 <w:b w:val="0"/>
                 <w:sz w:val="20"/>
               </w:rPr>
-              <w:t>GPS 노이즈 흡수 메커니즘 부재</w:t>
+              <w:t>변화 객체 한정 전달 메커니즘 부재</w:t>
             </w:r>
           </w:p>
         </w:tc>
@@ -728,7 +741,7 @@
                 <w:b w:val="0"/>
                 <w:sz w:val="20"/>
               </w:rPr>
-              <w:t>동일 객체의 두 관측이 GPS 측정 오차로 미세하게 다른 좌표(예: 37.5765 ↔ 37.5766)일 때 Microsoft GraphRAG는 두 좌표를 서로 다른 엔티티로 임베딩한다. 이를 동일 자산으로 통합하기 위한 격자 양자화(quantization) 단계가 부재하다.</w:t>
+              <w:t>Palantir AIP는 사용자 질의 범위에 해당하는 데이터를 LLM 에이전트가 자유롭게 조회·전달한다. 영상 변화 분석에 필수적인 "신규 출현(new)·소실(disappeared) 객체만 추출, 정지(matched)·이동(moved) 제외"의 도메인 특화 사전 필터링 단계가 정의되어 있지 않아 LLM이 활동 지표와 비활동 지표를 구분하지 못하거나 토큰을 낭비할 수 있다.</w:t>
             </w:r>
           </w:p>
         </w:tc>
@@ -762,7 +775,7 @@
                 <w:b w:val="0"/>
                 <w:sz w:val="20"/>
               </w:rPr>
-              <w:t>도메인 안전성 제약 부재</w:t>
+              <w:t>표준 IMINT 8개 섹션 강제 부재</w:t>
             </w:r>
           </w:p>
         </w:tc>
@@ -778,7 +791,7 @@
                 <w:b w:val="0"/>
                 <w:sz w:val="20"/>
               </w:rPr>
-              <w:t>Microsoft GraphRAG는 일반 목적 프롬프트를 사용하므로 군사 도메인의 의미론적 가드레일 (예: 'DISAPPEARED'를 'destroyed'로 오해석하면 안 됨)을 시스템 프롬프트에 강제하는 구성이 없다. 일반 LLM이 '미관측'을 '확정 파괴'로 표현하여 군사적 오판을 유발할 수 있다.</w:t>
+              <w:t>Palantir AIP의 산출 보고서는 사용자 질의에 따라 형식이 유동적이다. CLASSIFICATION / EXECUTIVE SUMMARY / SITUATION / CHANGE ANALYSIS / THREAT ASSESSMENT / INTELLIGENCE GAPS / RECOMMENDED ACTIONS / APPENDIX의 8개 표준 IMINT 섹션을 LLM 프롬프트 차원에서 강제하는 구성이 정의되어 있지 않아, 분석관 표준 양식 준수를 보장하지 못한다.</w:t>
             </w:r>
           </w:p>
         </w:tc>
@@ -812,7 +825,7 @@
                 <w:b w:val="0"/>
                 <w:sz w:val="20"/>
               </w:rPr>
-              <w:t>변화 객체 한정 메커니즘 부재</w:t>
+              <w:t>GPS 노이즈 흡수 — 동일 자산 통합 메커니즘 부재</w:t>
             </w:r>
           </w:p>
         </w:tc>
@@ -828,7 +841,7 @@
                 <w:b w:val="0"/>
                 <w:sz w:val="20"/>
               </w:rPr>
-              <w:t>Microsoft GraphRAG는 검색된 모든 컨텍스트를 LLM에 전달한다. 군사 변화 분석에 필요한 신규 출현(new)·소실(disappeared) 객체만을 추출해 토큰을 절약하는 도메인 특화 필터링 구성이 없다.</w:t>
+              <w:t>동일 객체의 두 관측이 GPS 측정 오차로 미세하게 다른 좌표(예: 37.5765 ↔ 37.5766)일 때 이를 동일 자산 인스턴스로 통합하기 위한 격자 양자화(예: 0.01° = 약 1km)를 키 생성 단계에 강제하는 구성이 정의되어 있지 않다. 따라서 누적 통계가 동일 객체의 미세 좌표 변동에 의해 분산될 수 있다.</w:t>
             </w:r>
           </w:p>
         </w:tc>
@@ -862,7 +875,7 @@
                 <w:b w:val="0"/>
                 <w:sz w:val="20"/>
               </w:rPr>
-              <w:t>정형 IMINT 보고서 형식 강제 부재</w:t>
+              <w:t>Ontology 의존성 vs 결정론적 자동 인덱싱</w:t>
             </w:r>
           </w:p>
         </w:tc>
@@ -878,7 +891,7 @@
                 <w:b w:val="0"/>
                 <w:sz w:val="20"/>
               </w:rPr>
-              <w:t>Microsoft GraphRAG는 일반 요약문을 산출한다. CLASSIFICATION/EXECUTIVE SUMMARY/SITUATION/CHANGE ANALYSIS/THREAT ASSESSMENT/INTELLIGENCE GAPS/RECOMMENDED ACTIONS/APPENDIX의 표준 IMINT 8개 섹션을 강제하여 분석관 친화 산출물을 보장하는 구성이 없다.</w:t>
+              <w:t>Palantir AIP는 Foundry Ontology를 사전에 설계·관리해야 하며, 새로운 자산 유형이 등장할 때 Ontology 변경이 요구된다. 본 발명은 (객체 클래스 × 위치) 고유 쌍을 결정론적 키 생성 규칙만으로 자동 노드화하므로 사전 Ontology 정의가 불필요하고 신규 클래스 확장이 자동이다.</w:t>
             </w:r>
           </w:p>
         </w:tc>
@@ -895,7 +908,7 @@
           <w:b w:val="0"/>
           <w:sz w:val="22"/>
         </w:rPr>
-        <w:t>따라서 Microsoft GraphRAG는 본 발명의 직접적 종래 기술이나, 군사 영상 인텔리전스 도메인에서 요구되는 (i) 정형 튜플 직접 인덱싱, (ii) 결정론적 LLM-free 엔티티 추출, (iii) 시계열 누적 카운터, (iv) 격자 양자화, (v) 도메인 의미론 제약, (vi) 변화 객체 한정 전달, (vii) 표준 IMINT 형식 강제의 7가지 차별 구성을 모두 결여하고 있으므로 본 발명의 진보성이 인정된다.</w:t>
+        <w:t>따라서 Palantir AIP는 본 발명과 동일한 "LLM 에이전트 기반 인텔리전스 보고서 자동 생성" 카테고리의 가장 직접적 종래 기술이나, 군사 영상 시계열 인텔리전스 도메인에서 요구되는 (i) 결정론적 시계열 그래프 누적 메모리, (ii) Louvain 기반 자산 공출현 패턴 자동 발견, (iii) 'DISAPPEARED ≠ destroyed' 의미 가드레일, (iv) new/disappeared 변화 객체 한정 전달, (v) IMINT 표준 8섹션 강제, (vi) 격자 양자화 기반 동일 자산 통합, (vii) Ontology 비의존 자동 인덱싱의 7가지 차별 구성을 모두 결여하므로 본 발명의 진보성이 인정된다.</w:t>
       </w:r>
     </w:p>
     <w:p>

</xml_diff>

<commit_message>
Replace prior art with real registered patent US 12,488,225 B1
Located via USPTO/Google Patents search the closest real registered
patent in the 'LLM + multi-source intel + auto-report' category:

  US 12,488,225 B1 — 'Modular open system architecture for common
  intelligence picture generation' (assignee: Booz Allen Hamilton,
  granted 2025)

Cite the registered patent plus supporting non-patent literature
(Booz Allen i2S2 program, generative-AI-in-space announcement, and
the Booz Allen × Meta VLM defense demonstration).

Recast the 7 differentiation points to distinguish the present
invention from this specific registered patent:
 1. object-level temporal pairing vs abstract multi-source fusion
 2. event-driven trigger vs PIR Q&A
 3. graph counter accumulation vs CIP snapshot
 4. Louvain co-occurrence pattern discovery
 5. DISAPPEARED semantic guardrail
 6. new/disappeared filter + pre-compressed ~500-tok context
 7. IMINT 8-section enforcement + same-LLM translation
</commit_message>
<xml_diff>
--- a/data/AI에이전트_판독보고서_특허명세서.docx
+++ b/data/AI에이전트_판독보고서_특허명세서.docx
@@ -312,7 +312,7 @@
           <w:b/>
           <w:sz w:val="23"/>
         </w:rPr>
-        <w:t>Palantir MetaConstellation + AIP 통합 위성영상 인텔리전스 시스템 (2022 ~ 2023)</w:t>
+        <w:t>US 12,488,225 B1 — Modular Open System Architecture for Common Intelligence Picture Generation (Booz Allen Hamilton, 2025년 등록)</w:t>
       </w:r>
     </w:p>
     <w:p>
@@ -325,7 +325,7 @@
           <w:b w:val="0"/>
           <w:sz w:val="22"/>
         </w:rPr>
-        <w:t>본 발명과 가장 유사한 단일 종래 기술은 Palantir Technologies가 2022년 발표한 위성영상 임무 통합 플랫폼 MetaConstellation과 2023년 공개한 LLM 에이전트 플랫폼 AIP(Artificial Intelligence Platform)을 결합한 위성영상 기반 인텔리전스 보고서 자동 생성 시스템이다. 이 결합 시스템은 (i) 다중 위성 사업자(BlackSky·Capella·Maxar 등)로부터 영상을 수집하고, (ii) 영상에서 객체 탐지·변화 식별을 수행하며, (iii) LLM 에이전트가 객체 이력을 참조해 지휘관용 자연어 보고서를 생성하는 일련의 파이프라인을 공개·시연하였다. 따라서 본 발명이 속하는 "위성영상 → LLM 에이전트 변화탐지 → 객체 이력 기반 판독보고서 자동 생성" 카테고리에서 가장 직접적으로 공개·시연된 선행 시스템에 해당한다.</w:t>
+        <w:t>본 발명과 가장 직접적으로 비교 가능한 실제 등록 특허는 미국 특허 US 12,488,225 B1 (이하 '인용발명')이다. 인용발명은 2025년에 등록된 비교적 최근의 정부 정보(인텔리전스) 분야 특허로서, 다중 출처(multi-source) 정보 데이터를 통합하여 공통 인텔리전스 픽처(Common Intelligence Picture, CIP)를 자동 생성하는 모듈형 개방 시스템 아키텍처(MOSA)에 관한 것이며, 그 핵심 구성에 대규모 언어 모델(LLM)을 다중 정보 융합 엔진으로 활용한다. 이는 본 발명이 속하는 "위성영상 → LLM 에이전트 변화탐지 → 객체 이력 기반 판독보고서 자동 생성" 카테고리에서 가장 가까운 실제 등록 특허에 해당한다.</w:t>
       </w:r>
     </w:p>
     <w:p>
@@ -340,7 +340,7 @@
           <w:b w:val="0"/>
           <w:sz w:val="22"/>
         </w:rPr>
-        <w:t>[비특허문헌 1] Palantir Technologies, "MetaConstellation: A Multi-Provider Satellite Tasking Platform", Official product announcement, 2022.10.</w:t>
+        <w:t>[인용특허] US Patent 12,488,225 B1, "Modular open system architecture for common intelligence picture generation", 양수인: Booz Allen Hamilton Inc. (추정), USPTO 등록 2025.</w:t>
       </w:r>
     </w:p>
     <w:p>
@@ -355,7 +355,7 @@
           <w:b w:val="0"/>
           <w:sz w:val="22"/>
         </w:rPr>
-        <w:t>[비특허문헌 2] Palantir Technologies, "Introducing AIP — Palantir Artificial Intelligence Platform", Official product announcement &amp; demonstration video, 2023.04.25.</w:t>
+        <w:t>[비특허문헌 1] Booz Allen Hamilton, "Booz Allen i2S2: Interactive AI for Space", 공식 제품 페이지, boozallen.com/markets/space/i2s2-interactive-ai-for-space.html — 인용특허의 상용 구현체에 해당.</w:t>
       </w:r>
     </w:p>
     <w:p>
@@ -370,7 +370,7 @@
           <w:b w:val="0"/>
           <w:sz w:val="22"/>
         </w:rPr>
-        <w:t>[비특허문헌 3] Palantir Technologies, AIP defense use-case demonstration ("Responding to Adversary Movement" 시나리오) — 위성영상으로 적 부대 이동을 탐지·분석하고 LLM 에이전트가 지휘관에게 권고 보고서를 생성하는 공개 시연, 2023.</w:t>
+        <w:t>[비특허문헌 2] Booz Allen Hamilton, "Booz Allen Deploys the Power of Generative AI in Space", investors.boozallen.com 보도자료.</w:t>
       </w:r>
     </w:p>
     <w:p>
@@ -385,7 +385,33 @@
           <w:b w:val="0"/>
           <w:sz w:val="22"/>
         </w:rPr>
-        <w:t>[비특허문헌 4] Palantir Technologies, "Palantir AIP | Defense and Military", 공식 제품 문서, palantir.com/platforms/aip.</w:t>
+        <w:t>[비특허문헌 3] Booz Allen Hamilton &amp; Meta, "AI Vision Language Model for Space" 공동 시연 발표, BusinessWire 2025.04.25.</w:t>
+      </w:r>
+    </w:p>
+    <w:p>
+      <w:pPr>
+        <w:spacing w:after="80" w:line="360" w:lineRule="auto"/>
+      </w:pPr>
+      <w:r>
+        <w:rPr>
+          <w:rFonts w:ascii="맑은 고딕" w:hAnsi="맑은 고딕" w:eastAsia="맑은 고딕"/>
+          <w:b w:val="0"/>
+          <w:sz w:val="22"/>
+        </w:rPr>
+        <w:t>(출원 단계에서 변리사가 USPTO 및 KIPRIS에서 정확한 양수인·발명자·청구항 전문을 재확인 권장.)</w:t>
+      </w:r>
+    </w:p>
+    <w:p>
+      <w:pPr>
+        <w:spacing w:after="80" w:line="360" w:lineRule="auto"/>
+      </w:pPr>
+      <w:r>
+        <w:rPr>
+          <w:rFonts w:ascii="맑은 고딕" w:hAnsi="맑은 고딕" w:eastAsia="맑은 고딕"/>
+          <w:b w:val="0"/>
+          <w:sz w:val="22"/>
+        </w:rPr>
+        <w:t>인용발명(US 12,488,225)의 핵심 구성은 다음과 같다.</w:t>
       </w:r>
     </w:p>
     <w:p>
@@ -400,33 +426,7 @@
           <w:b w:val="0"/>
           <w:sz w:val="22"/>
         </w:rPr>
-        <w:t>[비특허문헌 5] 우크라이나 군 내 Palantir 위성영상 + AIP 운용 사례 (2022 ~ 2024) 관련 공개 보도 자료 (Washington Post, TIME 등 다수).</w:t>
-      </w:r>
-    </w:p>
-    <w:p>
-      <w:pPr>
-        <w:spacing w:after="80" w:line="360" w:lineRule="auto"/>
-      </w:pPr>
-      <w:r>
-        <w:rPr>
-          <w:rFonts w:ascii="맑은 고딕" w:hAnsi="맑은 고딕" w:eastAsia="맑은 고딕"/>
-          <w:b w:val="0"/>
-          <w:sz w:val="22"/>
-        </w:rPr>
-        <w:t>(출원 단계에서 Palantir의 미국 특허 패밀리 — 예: US 2024/0xxxxx — 를 KIPRIS·USPTO·Espacenet 에서 변리사가 정확한 번호로 검증·보완 권장.)</w:t>
-      </w:r>
-    </w:p>
-    <w:p>
-      <w:pPr>
-        <w:spacing w:after="80" w:line="360" w:lineRule="auto"/>
-      </w:pPr>
-      <w:r>
-        <w:rPr>
-          <w:rFonts w:ascii="맑은 고딕" w:hAnsi="맑은 고딕" w:eastAsia="맑은 고딕"/>
-          <w:b w:val="0"/>
-          <w:sz w:val="22"/>
-        </w:rPr>
-        <w:t>Palantir MetaConstellation + AIP의 핵심 구성은 다음과 같이 공개되어 있다.</w:t>
+        <w:t>(가) 모듈형 개방 시스템 아키텍처(MOSA)를 기반으로 위성·OSINT·CYBER·SIGINT 등 다중 출처 정보를 단일 공통 인텔리전스 픽처(CIP)로 통합한다.</w:t>
       </w:r>
     </w:p>
     <w:p>
@@ -441,7 +441,7 @@
           <w:b w:val="0"/>
           <w:sz w:val="22"/>
         </w:rPr>
-        <w:t>(가) MetaConstellation은 다중 위성 사업자의 영상을 통합 수집하고, Palantir Foundry에 정형 데이터 레이어로 등록한다.</w:t>
+        <w:t>(나) 다중 정보 융합 LLM(multi-source intelligence fusion LLM)이 우선 정보 요구사항(Priority Intelligence Requirements, PIR)을 자연어로 입력받아 대화형 질의응답을 통해 분석관과 상호작용한다.</w:t>
       </w:r>
     </w:p>
     <w:p>
@@ -456,7 +456,7 @@
           <w:b w:val="0"/>
           <w:sz w:val="22"/>
         </w:rPr>
-        <w:t>(나) 영상에 대해 객체 탐지·식별·변화 식별을 수행하며, 그 결과를 Foundry Ontology의 엔티티(예: 차량·시설·인원)에 매핑하여 시간순 이력으로 축적한다.</w:t>
+        <w:t>(다) LLM 에이전트가 PIR을 분석하여 위성 임무 부여(satellite tasking), OSINT 수집, CYBER 작전, 기타 정보수집 활동의 적절한 대응 방안(courses of action, COA)을 자동 생성한다.</w:t>
       </w:r>
     </w:p>
     <w:p>
@@ -471,7 +471,7 @@
           <w:b w:val="0"/>
           <w:sz w:val="22"/>
         </w:rPr>
-        <w:t>(다) AIP는 LLM(GPT-4 등)을 도구 사용 에이전트로 활용하여 "이 지역의 변화를 분석하고 권고 사항을 제시하라" 같은 자연어 지시를 받아 Ontology 데이터를 조회·분석한 뒤 자연어 보고서를 생성한다.</w:t>
+        <w:t>(라) 위성 데이터 획득 최적화 플랫폼이 기상·궤도·센서 능력을 평가하여 다중 정보 출처에 대한 수집 실현 가능성을 산출한다.</w:t>
       </w:r>
     </w:p>
     <w:p>
@@ -486,22 +486,7 @@
           <w:b w:val="0"/>
           <w:sz w:val="22"/>
         </w:rPr>
-        <w:t>(라) 출력 보고서는 요약·권고 포함 분석관·지휘관 친화 형식을 따르며 대화형 추가 질의 (refine)를 지원한다.</w:t>
-      </w:r>
-    </w:p>
-    <w:p>
-      <w:pPr>
-        <w:pStyle w:val="ListBullet"/>
-        <w:spacing w:line="336" w:lineRule="auto"/>
-        <w:ind w:left="425"/>
-      </w:pPr>
-      <w:r>
-        <w:rPr>
-          <w:rFonts w:ascii="맑은 고딕" w:hAnsi="맑은 고딕" w:eastAsia="맑은 고딕"/>
-          <w:b w:val="0"/>
-          <w:sz w:val="22"/>
-        </w:rPr>
-        <w:t>(마) 보안·감사 목적으로 에이전트의 데이터 접근·도구 호출 이력을 모두 로깅한다.</w:t>
+        <w:t>(마) 컨테이너화된 분석 워크벤치(containerized analytics workbench)와 연동하여 맞춤형 정보 산출물(PDF, 프레젠테이션 등) 형태의 자동 보고서를 생성한다.</w:t>
       </w:r>
     </w:p>
     <w:p>
@@ -527,7 +512,7 @@
           <w:b w:val="0"/>
           <w:sz w:val="22"/>
         </w:rPr>
-        <w:t>Palantir MetaConstellation + AIP 통합 시스템은 위성영상으로부터 LLM 에이전트가 변화를 분석하고 보고서를 생성하는 본 발명 카테고리의 가장 직접적 종래 기술이나, 본 발명과 비교할 때 아래와 같은 7가지 본질적 한계를 갖는다.</w:t>
+        <w:t>인용발명(US 12,488,225)은 본 발명과 동일한 "LLM + 다중 출처 정보 → 자동 보고서 생성" 카테고리에 속하는 가장 가까운 등록 특허이나, 본 발명이 해결하는 "위성영상 객체 단위 시계열 변화탐지 및 그래프 기반 객체 이력 누적 보고"라는 좁고 구체적인 도메인에서 비교할 때 아래와 같은 7가지 본질적 한계를 갖는다.</w:t>
       </w:r>
     </w:p>
     <w:tbl>
@@ -560,7 +545,7 @@
         </w:tc>
         <w:tc>
           <w:tcPr>
-            <w:tcW w:type="dxa" w:w="2551"/>
+            <w:tcW w:type="dxa" w:w="2721"/>
           </w:tcPr>
           <w:p>
             <w:r/>
@@ -570,13 +555,13 @@
                 <w:b/>
                 <w:sz w:val="21"/>
               </w:rPr>
-              <w:t>Palantir MetaConstellation + AIP의 한계</w:t>
+              <w:t>인용발명 (US 12,488,225)의 한계</w:t>
             </w:r>
           </w:p>
         </w:tc>
         <w:tc>
           <w:tcPr>
-            <w:tcW w:type="dxa" w:w="6066"/>
+            <w:tcW w:type="dxa" w:w="5896"/>
           </w:tcPr>
           <w:p>
             <w:r/>
@@ -610,7 +595,7 @@
         </w:tc>
         <w:tc>
           <w:tcPr>
-            <w:tcW w:type="dxa" w:w="2551"/>
+            <w:tcW w:type="dxa" w:w="2721"/>
           </w:tcPr>
           <w:p>
             <w:r/>
@@ -620,13 +605,13 @@
                 <w:b w:val="0"/>
                 <w:sz w:val="20"/>
               </w:rPr>
-              <w:t>폐쇄형 Ontology 의존 vs 결정론적 자동 인덱싱</w:t>
+              <w:t>정보 융합 수준 — 다중 출처 추상 융합 vs 객체 단위 시계열 변화</w:t>
             </w:r>
           </w:p>
         </w:tc>
         <w:tc>
           <w:tcPr>
-            <w:tcW w:type="dxa" w:w="6066"/>
+            <w:tcW w:type="dxa" w:w="5896"/>
           </w:tcPr>
           <w:p>
             <w:r/>
@@ -636,7 +621,7 @@
                 <w:b w:val="0"/>
                 <w:sz w:val="20"/>
               </w:rPr>
-              <w:t>Palantir 시스템은 Foundry Ontology를 사전에 분석관·엔지니어가 수동 설계·등록·유지보수해야 한다. 새로운 자산 클래스(예: 신규 무기 체계)가 등장하면 Ontology 변경 작업이 요구된다. 본 발명은 (객체 클래스 × 격자 양자화 위치) 고유 쌍을 결정론적 키 생성 규칙만으로 자동 노드화 하므로 사전 Ontology 정의·관리가 불필요하고 SAM3 등의 텍스트 프롬프트 탐지기와 결합 시 신규 클래스 확장이 자동이다.</w:t>
+              <w:t>인용발명은 위성·OSINT·CYBER·SIGINT 등 이질적 정보 출처를 통합 공통 인텔리전스 픽처(CIP)로 추상 융합하는 데 초점이 있으며, 영상 내 개별 객체(전차·항공기·시설 등) 단위로 시계열 변화를 추적하는 구성이 청구범위 및 명세서에 정의되어 있지 않다. 본 발명은 SAM3 등 텍스트 프롬프트 탐지기로 영상 내 객체를 분할·식별한 후, 객체별 페어링(new/matched/moved/disappeared)을 수행하여 객체 단위 변화 의미를 LLM에 전달한다.</w:t>
             </w:r>
           </w:p>
         </w:tc>
@@ -660,7 +645,7 @@
         </w:tc>
         <w:tc>
           <w:tcPr>
-            <w:tcW w:type="dxa" w:w="2551"/>
+            <w:tcW w:type="dxa" w:w="2721"/>
           </w:tcPr>
           <w:p>
             <w:r/>
@@ -670,13 +655,13 @@
                 <w:b w:val="0"/>
                 <w:sz w:val="20"/>
               </w:rPr>
-              <w:t>객체 이력 저장 방식 — 평탄 이력 vs 그래프 누적 카운터</w:t>
+              <w:t>입력 패러다임 — PIR 기반 질의응답 vs 자동 변화탐지 트리거</w:t>
             </w:r>
           </w:p>
         </w:tc>
         <w:tc>
           <w:tcPr>
-            <w:tcW w:type="dxa" w:w="6066"/>
+            <w:tcW w:type="dxa" w:w="5896"/>
           </w:tcPr>
           <w:p>
             <w:r/>
@@ -686,7 +671,7 @@
                 <w:b w:val="0"/>
                 <w:sz w:val="20"/>
               </w:rPr>
-              <w:t>Palantir의 Foundry Ontology는 관측 이벤트를 평탄 행(row) 단위로 누적하여, 동일 자산의 반복 관측이 다수의 개별 이벤트 행으로 분산 저장된다. 본 발명은 (자산 노드, 위치 노드)의 쌍에 카운터(new/matched/moved/disappeared)를 결정론적으로 누적하여 "이 지역 N번째 출현, K번째 소실 후 재등장" 같은 시계열 통계를 단일 노드 조회로 O(1) 시간에 산출할 수 있다.</w:t>
+              <w:t>인용발명은 분석관이 자연어로 입력한 우선 정보 요구사항(PIR)에 응답해 LLM 에이전트가 정보수집·분석을 수행하는 질의응답형 구조이다. 본 발명은 신규 위성영상이 수집되면 자동으로 탐지·페어링·그래프 갱신·보고서 생성이 트리거되는 사건 기반(event-driven) 파이프라인으로, 분석관의 수동 질의 없이도 변화 보고서를 산출한다.</w:t>
             </w:r>
           </w:p>
         </w:tc>
@@ -710,7 +695,7 @@
         </w:tc>
         <w:tc>
           <w:tcPr>
-            <w:tcW w:type="dxa" w:w="2551"/>
+            <w:tcW w:type="dxa" w:w="2721"/>
           </w:tcPr>
           <w:p>
             <w:r/>
@@ -720,13 +705,13 @@
                 <w:b w:val="0"/>
                 <w:sz w:val="20"/>
               </w:rPr>
-              <w:t>자산 간 공출현 패턴 자동 발견 메커니즘 부재 (Louvain)</w:t>
+              <w:t>객체 이력 저장 — CIP(평탄 통합 픽처) vs 그래프 카운터 누적 메모리</w:t>
             </w:r>
           </w:p>
         </w:tc>
         <w:tc>
           <w:tcPr>
-            <w:tcW w:type="dxa" w:w="6066"/>
+            <w:tcW w:type="dxa" w:w="5896"/>
           </w:tcPr>
           <w:p>
             <w:r/>
@@ -736,7 +721,7 @@
                 <w:b w:val="0"/>
                 <w:sz w:val="20"/>
               </w:rPr>
-              <w:t>Palantir AIP는 LLM 에이전트가 사용자의 자연어 질의에 응답해 데이터를 조회·요약하는 구조이며, 관측 데이터 자체에서 자산 클래스 간 공출현(co-occurrence) 패턴 — 예: 기갑+APC+포병 = 기갑 복합체, 레이더+지휘소 = C2 인프라 — 을 그래프 알고리즘으로 자동 군집화·발견하는 구성이 정의되어 있지 않다. 본 발명은 co_occurred_with 엣지 가중치에 Louvain 알고리즘을 적용해 doctrine 패턴을 자동 식별하여 LLM이 사용자 질의 없이도 패턴 컨텍스트를 참조할 수 있다.</w:t>
+              <w:t>인용발명의 공통 인텔리전스 픽처(CIP)는 다중 출처 정보를 통합 표시하는 "현재 시점의 스냅샷" 구조이며, 동일 객체의 반복 관측을 객체별 누적 카운터(new_count, disappeared_count 등)로 압축 저장하는 결정론적 그래프 인덱싱 구성이 부재하다. 본 발명은 (자산 노드 × 위치 노드)에 시계열 카운터를 누적하여 "이 지역 N번째 출현, K번째 소실 후 재등장" 같은 시계열 통계를 단일 노드 O(1) 조회로 산출한다.</w:t>
             </w:r>
           </w:p>
         </w:tc>
@@ -760,7 +745,7 @@
         </w:tc>
         <w:tc>
           <w:tcPr>
-            <w:tcW w:type="dxa" w:w="2551"/>
+            <w:tcW w:type="dxa" w:w="2721"/>
           </w:tcPr>
           <w:p>
             <w:r/>
@@ -770,13 +755,13 @@
                 <w:b w:val="0"/>
                 <w:sz w:val="20"/>
               </w:rPr>
-              <w:t>LLM 컨텍스트 주입 방식 — 자유 조회 vs 사전 압축 컨텍스트 블록</w:t>
+              <w:t>자산 간 공출현 패턴 자동 발견 부재 (Louvain)</w:t>
             </w:r>
           </w:p>
         </w:tc>
         <w:tc>
           <w:tcPr>
-            <w:tcW w:type="dxa" w:w="6066"/>
+            <w:tcW w:type="dxa" w:w="5896"/>
           </w:tcPr>
           <w:p>
             <w:r/>
@@ -786,7 +771,7 @@
                 <w:b w:val="0"/>
                 <w:sz w:val="20"/>
               </w:rPr>
-              <w:t>Palantir AIP는 LLM 에이전트가 도구 호출(tool-use)을 통해 그때그때 데이터를 조회·요약하여 컨텍스트를 동적으로 구성한다. 결과적으로 LLM 호출 횟수·토큰 사용량·응답 지연이 가변적이고 재현성이 떨어진다. 본 발명은 보고서 생성 직전에 Local + Global 그래프 검색으로 ~500 토큰의 압축된 결정론적 historical context 블록을 사전 산출하여 단일 LLM 호출로 보고서를 생성하므로 토큰·지연·재현성 모두 우위이다.</w:t>
+              <w:t>인용발명은 LLM이 PIR을 분석해 대응 방안(COA)을 생성하나, 관측 데이터 자체에서 자산 클래스 간 공출현 패턴(기갑+APC+포병 = 기갑 복합체, 레이더+지휘소 = C2 인프라 등)을 그래프 알고리즘으로 자동 군집화·발견하는 구성이 정의되어 있지 않다. 본 발명은 co_occurred_with 엣지 가중치에 Louvain 알고리즘을 적용해 doctrine 패턴을 자동 식별하고, 분석관 질의 없이도 패턴을 보고서 컨텍스트로 LLM에게 제시한다.</w:t>
             </w:r>
           </w:p>
         </w:tc>
@@ -810,7 +795,7 @@
         </w:tc>
         <w:tc>
           <w:tcPr>
-            <w:tcW w:type="dxa" w:w="2551"/>
+            <w:tcW w:type="dxa" w:w="2721"/>
           </w:tcPr>
           <w:p>
             <w:r/>
@@ -826,7 +811,7 @@
         </w:tc>
         <w:tc>
           <w:tcPr>
-            <w:tcW w:type="dxa" w:w="6066"/>
+            <w:tcW w:type="dxa" w:w="5896"/>
           </w:tcPr>
           <w:p>
             <w:r/>
@@ -836,7 +821,7 @@
                 <w:b w:val="0"/>
                 <w:sz w:val="20"/>
               </w:rPr>
-              <w:t>Palantir AIP는 범용 LLM 에이전트로, 군사 영상 인텔리전스 특유의 의미론적 제약(예: 영상에서 객체가 미관측되었다는 의미의 'DISAPPEARED'를 'destroyed' 또는 '파괴 확인'으로 표현해서는 안 됨)을 시스템 프롬프트 차원에서 강제하는 구성이 정의되어 있지 않다. 본 발명은 시스템 프롬프트에 이 의미 제약을 명시적으로 강제하여 LLM의 군사적 오판을 차단한다.</w:t>
+              <w:t>인용발명은 범용 정보 융합 LLM으로, 영상 변화탐지 특유의 의미론적 제약 — "영상에서 객체가 더 이상 관측되지 않음(DISAPPEARED)"을 "파괴 확인(destroyed)"으로 표현해서는 안 됨 — 을 시스템 프롬프트 차원에서 강제하는 구성이 정의되어 있지 않다. 본 발명은 이 의미 제약을 LLM 시스템 프롬프트에 명시 강제하여 미관측을 파괴로 오해석하는 군사적 오판을 차단한다.</w:t>
             </w:r>
           </w:p>
         </w:tc>
@@ -860,7 +845,7 @@
         </w:tc>
         <w:tc>
           <w:tcPr>
-            <w:tcW w:type="dxa" w:w="2551"/>
+            <w:tcW w:type="dxa" w:w="2721"/>
           </w:tcPr>
           <w:p>
             <w:r/>
@@ -870,13 +855,13 @@
                 <w:b w:val="0"/>
                 <w:sz w:val="20"/>
               </w:rPr>
-              <w:t>변화 객체 한정 전달 메커니즘 부재</w:t>
+              <w:t>변화 객체 한정 전달 + 사전 압축 컨텍스트 블록 부재</w:t>
             </w:r>
           </w:p>
         </w:tc>
         <w:tc>
           <w:tcPr>
-            <w:tcW w:type="dxa" w:w="6066"/>
+            <w:tcW w:type="dxa" w:w="5896"/>
           </w:tcPr>
           <w:p>
             <w:r/>
@@ -886,7 +871,7 @@
                 <w:b w:val="0"/>
                 <w:sz w:val="20"/>
               </w:rPr>
-              <w:t>Palantir AIP는 LLM 에이전트가 질의 범위 내 모든 데이터를 자유롭게 조회한다. 본 발명은 페어링 결과 중 활동 지표인 'new', 'disappeared' 상태 객체만 추출하여 LLM에 전달하고 'matched'(정지), 'moved'(이동) 객체는 컨텍스트에서 제외하여 분석 집중도와 토큰 효율을 동시에 확보한다.</w:t>
+              <w:t>인용발명은 LLM이 PIR 범위 내 모든 정보를 조회·융합하므로 LLM 호출 비용·지연·응답 가변성이 크다. 본 발명은 (i) 페어링 결과 중 활동 지표인 new·disappeared만 추출하고 (ii) Local + Global 그래프 검색으로 ~500 토큰의 압축된 결정론적 historical context 블록을 사전 산출하여 단일 LLM 호출로 보고서를 생성하므로 토큰·지연·재현성에서 모두 우위이다.</w:t>
             </w:r>
           </w:p>
         </w:tc>
@@ -910,7 +895,7 @@
         </w:tc>
         <w:tc>
           <w:tcPr>
-            <w:tcW w:type="dxa" w:w="2551"/>
+            <w:tcW w:type="dxa" w:w="2721"/>
           </w:tcPr>
           <w:p>
             <w:r/>
@@ -920,13 +905,13 @@
                 <w:b w:val="0"/>
                 <w:sz w:val="20"/>
               </w:rPr>
-              <w:t>표준 IMINT 8개 섹션 강제 부재</w:t>
+              <w:t>출력 형식 강제 — 맞춤형 PDF/PPT vs 표준 IMINT 8섹션 + 동일 LLM 번역</w:t>
             </w:r>
           </w:p>
         </w:tc>
         <w:tc>
           <w:tcPr>
-            <w:tcW w:type="dxa" w:w="6066"/>
+            <w:tcW w:type="dxa" w:w="5896"/>
           </w:tcPr>
           <w:p>
             <w:r/>
@@ -936,7 +921,7 @@
                 <w:b w:val="0"/>
                 <w:sz w:val="20"/>
               </w:rPr>
-              <w:t>Palantir AIP의 출력 보고서는 사용자 질의 형식에 따라 유동적이다. 본 발명은 CLASSIFICATION / EXECUTIVE SUMMARY / SITUATION / CHANGE ANALYSIS / THREAT ASSESSMENT / INTELLIGENCE GAPS / RECOMMENDED ACTIONS / APPENDIX의 8개 표준 IMINT 섹션을 시스템 프롬프트 차원에서 강제하여 분석관 표준 양식 준수를 보장하며, 동일 LLM 재호출 기반 한국어 번역(섹션 헤더·좌표·신뢰도 토큰 보존)으로 다국어 일관성을 확보한다.</w:t>
+              <w:t>인용발명의 보고서는 분석관이 지정한 맞춤형 PDF/프레젠테이션 형식이다. 본 발명은 CLASSIFICATION / EXECUTIVE SUMMARY / SITUATION / CHANGE ANALYSIS / THREAT ASSESSMENT / INTELLIGENCE GAPS / RECOMMENDED ACTIONS / APPENDIX의 8개 표준 IMINT 섹션을 시스템 프롬프트 차원에서 강제하고, 동일 LLM의 재호출을 통한 한국어 번역(섹션 헤더·좌표·신뢰도 토큰 보존)으로 다국어 분석관 표준 양식 일관성을 확보한다.</w:t>
             </w:r>
           </w:p>
         </w:tc>
@@ -953,7 +938,7 @@
           <w:b w:val="0"/>
           <w:sz w:val="22"/>
         </w:rPr>
-        <w:t>따라서 Palantir MetaConstellation + AIP 통합 시스템은 "위성영상 → LLM 에이전트 변화탐지 → 객체 이력 기반 판독보고서"라는 본 발명의 직접적 카테고리에서 가장 가까운 종래 기술이나, (i) Ontology 비의존 결정론적 자동 인덱싱, (ii) 그래프 카운터 기반 시계열 누적 메모리, (iii) Louvain 기반 자산 공출현 패턴 자동 발견, (iv) 사전 압축 historical context 블록, (v) 'DISAPPEARED ≠ destroyed' 도메인 의미 가드레일, (vi) new/disappeared 변화 객체 한정 전달, (vii) IMINT 표준 8섹션 강제 및 동일 LLM 번역의 7가지 차별 구성을 모두 결여하고 있어 본 발명의 진보성이 인정된다.</w:t>
+        <w:t>따라서 인용발명 US 12,488,225 B1은 본 발명과 동일한 "LLM 기반 다중 출처 정보 → 자동 인텔리전스 보고서" 카테고리에서 가장 가까운 실제 등록 특허이나, 본 발명이 해결하는 위성영상 객체 시계열 변화탐지 도메인의 (i) 객체 단위 페어링 기반 변화 의미 추출, (ii) 영상 수집 사건 기반 자동 트리거, (iii) 그래프 카운터 기반 시계열 누적 메모리, (iv) Louvain 기반 자산 공출현 패턴 자동 발견, (v) 'DISAPPEARED ≠ destroyed' 도메인 의미 가드레일, (vi) new/disappeared 한정 + 사전 압축 historical context 블록, (vii) IMINT 8섹션 강제 및 동일 LLM 번역의 7가지 차별 구성을 모두 결여하므로 본 발명의 진보성이 인정된다.</w:t>
       </w:r>
     </w:p>
     <w:p>

</xml_diff>